<commit_message>
Reorganiza agenda del Dia 3: Observabilidad abre el dia y Workshop BCI pasa a 65 min
- Observabilidad y ciclo de vida pasa a 09:00-09:30; Dia 3 termina a las 13:00.
- Workshop BCI se extiende a 65 min (11:35-12:40) con cierre 12:40-13:00.
- Se elimina contenido de GenAIOps/AI Search avanzado/CI/CD en decks y laboratorios.
- Checklist renombrado a checklist-produccion-seguridad (grupo F: Evaluaciones y calidad).
- Runbook, plan B, indices y LEEME alineados con la nueva agenda.

Co-authored-by: Copilot App <223556219+Copilot@users.noreply.github.com>
Copilot-Session: 86daa5b3-36a5-4f64-bdf5-099c77fa6da6
</commit_message>
<xml_diff>
--- a/laboratorios/dia3-workshop-arquitectura/caso-austral-bank.docx
+++ b/laboratorios/dia3-workshop-arquitectura/caso-austral-bank.docx
@@ -21,7 +21,7 @@
         <w:rPr>
           <w:b/>
         </w:rPr>
-        <w:t>Workshop BCI · Architecture Decision Workshop · Día 3 (12:05–12:40) · Material del participante</w:t>
+        <w:t>Workshop BCI · Architecture Decision Workshop · Día 3 (11:35–12:40) · Material del participante</w:t>
       </w:r>
     </w:p>
     <w:p>
@@ -1518,12 +1518,12 @@
         <w:pStyle w:val="Heading2"/>
       </w:pPr>
       <w:r>
-        <w:t>8. Cómo trabajar (35 min, 5 pasos)</w:t>
+        <w:t>8. Cómo trabajar (65 min, 5 pasos)</w:t>
       </w:r>
     </w:p>
     <w:p>
       <w:r>
-        <w:t xml:space="preserve">Contexto 5 min → Canvas 10 → Amenazas 8 → SLOs y evaluación 7 → Backlog 5. Prefiere una decisión </w:t>
+        <w:t xml:space="preserve">Contexto 5 min → Canvas 20 → Amenazas 15 → SLOs y evaluación 12 → Backlog 13. Prefiere una decisión </w:t>
       </w:r>
       <w:r>
         <w:rPr>
@@ -1545,6 +1545,8 @@
       </w:r>
     </w:p>
     <w:sectPr>
+      <w:headerReference w:type="default" r:id="rId8"/>
+      <w:footerReference w:type="default" r:id="rId9"/>
       <w:pgSz w:w="11906" w:h="16838"/>
       <w:pgMar w:top="850" w:right="850" w:bottom="850" w:left="850" w:header="720" w:footer="720" w:gutter="0"/>
       <w:cols w:space="720"/>
@@ -1552,6 +1554,26 @@
     </w:sectPr>
   </w:body>
 </w:document>
+</file>
+
+<file path=word/footer1.xml><?xml version="1.0" encoding="utf-8"?>
+<w:ftr xmlns:m="http://schemas.openxmlformats.org/officeDocument/2006/math" xmlns:mc="http://schemas.openxmlformats.org/markup-compatibility/2006" xmlns:mo="http://schemas.microsoft.com/office/mac/office/2008/main" xmlns:mv="urn:schemas-microsoft-com:mac:vml" xmlns:o="urn:schemas-microsoft-com:office:office" xmlns:r="http://schemas.openxmlformats.org/officeDocument/2006/relationships" xmlns:v="urn:schemas-microsoft-com:vml" xmlns:w10="urn:schemas-microsoft-com:office:word" xmlns:w14="http://schemas.microsoft.com/office/word/2010/wordml" xmlns:w="http://schemas.openxmlformats.org/wordprocessingml/2006/main" xmlns:wne="http://schemas.microsoft.com/office/word/2006/wordml" xmlns:wp14="http://schemas.microsoft.com/office/word/2010/wordprocessingDrawing" xmlns:wp="http://schemas.openxmlformats.org/drawingml/2006/wordprocessingDrawing" xmlns:wpc="http://schemas.microsoft.com/office/word/2010/wordprocessingCanvas" xmlns:wpg="http://schemas.microsoft.com/office/word/2010/wordprocessingGroup" xmlns:wpi="http://schemas.microsoft.com/office/word/2010/wordprocessingInk" xmlns:wps="http://schemas.microsoft.com/office/word/2010/wordprocessingShape" mc:Ignorable="w14 wp14">
+  <w:p>
+    <w:pPr>
+      <w:pStyle w:val="Footer"/>
+    </w:pPr>
+  </w:p>
+</w:ftr>
+</file>
+
+<file path=word/header1.xml><?xml version="1.0" encoding="utf-8"?>
+<w:hdr xmlns:m="http://schemas.openxmlformats.org/officeDocument/2006/math" xmlns:mc="http://schemas.openxmlformats.org/markup-compatibility/2006" xmlns:mo="http://schemas.microsoft.com/office/mac/office/2008/main" xmlns:mv="urn:schemas-microsoft-com:mac:vml" xmlns:o="urn:schemas-microsoft-com:office:office" xmlns:r="http://schemas.openxmlformats.org/officeDocument/2006/relationships" xmlns:v="urn:schemas-microsoft-com:vml" xmlns:w10="urn:schemas-microsoft-com:office:word" xmlns:w14="http://schemas.microsoft.com/office/word/2010/wordml" xmlns:w="http://schemas.openxmlformats.org/wordprocessingml/2006/main" xmlns:wne="http://schemas.microsoft.com/office/word/2006/wordml" xmlns:wp14="http://schemas.microsoft.com/office/word/2010/wordprocessingDrawing" xmlns:wp="http://schemas.openxmlformats.org/drawingml/2006/wordprocessingDrawing" xmlns:wpc="http://schemas.microsoft.com/office/word/2010/wordprocessingCanvas" xmlns:wpg="http://schemas.microsoft.com/office/word/2010/wordprocessingGroup" xmlns:wpi="http://schemas.microsoft.com/office/word/2010/wordprocessingInk" xmlns:wps="http://schemas.microsoft.com/office/word/2010/wordprocessingShape" mc:Ignorable="w14 wp14">
+  <w:p>
+    <w:pPr>
+      <w:pStyle w:val="Header"/>
+    </w:pPr>
+  </w:p>
+</w:hdr>
 </file>
 
 <file path=word/numbering.xml><?xml version="1.0" encoding="utf-8"?>

</xml_diff>